<commit_message>
Remove EBAC references from the repository
- Neutral program name in the docs and the pyproject/uv.lock project name
- Drop EBAC platform lines from the assignment instructions
- Replace local ebac paths in restore.sql and dead Copilot links in notebooks
- Credit dataset sources to the JoseRaulCastro GitHub profile
- Store the two LMS-hosted images locally
- Clean image alt text in the m32/m39 docx and drop __pycache__ from the m24 zip
- Strip dead link annotations from the m26/m28/m31 PDFs
- Regenerate the m27/m33/m43 solution PDFs from the current notebooks
- Delete the unreferenced LMS screenshot in m41

Co-Authored-By: Claude Opus 5.5 <noreply@anthropic.com>
</commit_message>
<xml_diff>
--- a/s06-estadistica/m32-estadistica-descriptiva/m32-estadistica-descriptiva-solucion.docx
+++ b/s06-estadistica/m32-estadistica-descriptiva/m32-estadistica-descriptiva-solucion.docx
@@ -59,7 +59,7 @@
               <a:graphicData uri="http://schemas.openxmlformats.org/drawingml/2006/picture">
                 <pic:pic>
                   <pic:nvPicPr>
-                    <pic:cNvPr descr="https://static.lms.ebac.mx/embeds/a7a0fb88-8eca-420b-bd1a-7c8ef775d9fc/original.png" id="22" name="Picture"/>
+                    <pic:cNvPr descr="original.png" id="22" name="Picture"/>
                     <pic:cNvPicPr>
                       <a:picLocks noChangeArrowheads="1" noChangeAspect="1"/>
                     </pic:cNvPicPr>
@@ -558,7 +558,7 @@
               <a:graphicData uri="http://schemas.openxmlformats.org/drawingml/2006/picture">
                 <pic:pic>
                   <pic:nvPicPr>
-                    <pic:cNvPr descr="C:\Users\julih\Insync\jcc30986@gmail.com\drive\EBAC\An%C3%A1lisis%20de%20datos\M%C3%B3dulo%202\assets\original-1702922514212-4.png" id="33" name="Picture"/>
+                    <pic:cNvPr descr="original-1702922514212-4.png" id="33" name="Picture"/>
                     <pic:cNvPicPr>
                       <a:picLocks noChangeArrowheads="1" noChangeAspect="1"/>
                     </pic:cNvPicPr>
@@ -608,7 +608,7 @@
               <a:graphicData uri="http://schemas.openxmlformats.org/drawingml/2006/picture">
                 <pic:pic>
                   <pic:nvPicPr>
-                    <pic:cNvPr descr="C:\Users\julih\Insync\jcc30986@gmail.com\drive\EBAC\An%C3%A1lisis%20de%20datos\M%C3%B3dulo%202\assets\original-1702922521436-7.png" id="36" name="Picture"/>
+                    <pic:cNvPr descr="original-1702922521436-7.png" id="36" name="Picture"/>
                     <pic:cNvPicPr>
                       <a:picLocks noChangeArrowheads="1" noChangeAspect="1"/>
                     </pic:cNvPicPr>
@@ -658,7 +658,7 @@
               <a:graphicData uri="http://schemas.openxmlformats.org/drawingml/2006/picture">
                 <pic:pic>
                   <pic:nvPicPr>
-                    <pic:cNvPr descr="C:\Users\julih\Insync\jcc30986@gmail.com\drive\EBAC\An%C3%A1lisis%20de%20datos\M%C3%B3dulo%202\assets\original-1702922533045-10.png" id="39" name="Picture"/>
+                    <pic:cNvPr descr="original-1702922533045-10.png" id="39" name="Picture"/>
                     <pic:cNvPicPr>
                       <a:picLocks noChangeArrowheads="1" noChangeAspect="1"/>
                     </pic:cNvPicPr>
@@ -708,7 +708,7 @@
               <a:graphicData uri="http://schemas.openxmlformats.org/drawingml/2006/picture">
                 <pic:pic>
                   <pic:nvPicPr>
-                    <pic:cNvPr descr="C:\Users\julih\Insync\jcc30986@gmail.com\drive\EBAC\An%C3%A1lisis%20de%20datos\M%C3%B3dulo%202\assets\original-1702922543620-13.png" id="42" name="Picture"/>
+                    <pic:cNvPr descr="original-1702922543620-13.png" id="42" name="Picture"/>
                     <pic:cNvPicPr>
                       <a:picLocks noChangeArrowheads="1" noChangeAspect="1"/>
                     </pic:cNvPicPr>
@@ -758,7 +758,7 @@
               <a:graphicData uri="http://schemas.openxmlformats.org/drawingml/2006/picture">
                 <pic:pic>
                   <pic:nvPicPr>
-                    <pic:cNvPr descr="C:\Users\julih\Insync\jcc30986@gmail.com\drive\EBAC\An%C3%A1lisis%20de%20datos\M%C3%B3dulo%202\assets\original.png" id="45" name="Picture"/>
+                    <pic:cNvPr descr="original.png" id="45" name="Picture"/>
                     <pic:cNvPicPr>
                       <a:picLocks noChangeArrowheads="1" noChangeAspect="1"/>
                     </pic:cNvPicPr>
@@ -943,7 +943,7 @@
               <a:graphicData uri="http://schemas.openxmlformats.org/drawingml/2006/picture">
                 <pic:pic>
                   <pic:nvPicPr>
-                    <pic:cNvPr descr="C:\Users\julih\Insync\jcc30986@gmail.com\drive\EBAC\An%C3%A1lisis%20de%20datos\M%C3%B3dulo%202\assets\original.jpeg" id="51" name="Picture"/>
+                    <pic:cNvPr descr="original.jpeg" id="51" name="Picture"/>
                     <pic:cNvPicPr>
                       <a:picLocks noChangeArrowheads="1" noChangeAspect="1"/>
                     </pic:cNvPicPr>

</xml_diff>